<commit_message>
Added the project docx
</commit_message>
<xml_diff>
--- a/Project Neural AI.docx
+++ b/Project Neural AI.docx
@@ -12,15 +12,380 @@
     </w:p>
     <w:p>
       <w:r>
-        <w:t>By Mauricio Rodriguez and Eamonn Corban</w:t>
+        <w:t>Document written by: Mauricio Rodriguez</w:t>
+      </w:r>
+    </w:p>
+    <w:p>
+      <w:r>
+        <w:t>Group members:</w:t>
+      </w:r>
+      <w:r>
+        <w:t xml:space="preserve"> Mauricio Rodriguez and Eamonn Corban</w:t>
+      </w:r>
+    </w:p>
+    <w:p>
+      <w:pPr>
+        <w:pStyle w:val="Heading2"/>
+      </w:pPr>
+      <w:r>
+        <w:t>AI use in the project:</w:t>
+      </w:r>
+    </w:p>
+    <w:p>
+      <w:r>
+        <w:t>To simulate a real development workflow. Since the project does not require us to come up with the design choices, Mauricio used Claude AI to help define the non-coding aspects of this project as Claude was the Tech Lean and we were the developers.</w:t>
+      </w:r>
+    </w:p>
+    <w:p>
+      <w:pPr>
+        <w:pStyle w:val="Heading4"/>
+      </w:pPr>
+      <w:r>
+        <w:t>The original AI designed page is in the repository: /images/page-ui.png</w:t>
+      </w:r>
+    </w:p>
+    <w:p>
+      <w:pPr>
+        <w:pStyle w:val="Heading4"/>
+      </w:pPr>
+      <w:r>
+        <w:t xml:space="preserve">The differences between the original design and </w:t>
+      </w:r>
+      <w:proofErr w:type="gramStart"/>
+      <w:r>
+        <w:t>the final result</w:t>
+      </w:r>
+      <w:proofErr w:type="gramEnd"/>
+      <w:r>
+        <w:t xml:space="preserve"> were deliberate choices made during the development to follow the </w:t>
+      </w:r>
+      <w:r>
+        <w:t>Student Code of Conduct</w:t>
+      </w:r>
+      <w:r>
+        <w:t xml:space="preserve"> and avoid plagiarism.</w:t>
       </w:r>
     </w:p>
     <w:p/>
     <w:p>
+      <w:r>
+        <w:rPr>
+          <w:rStyle w:val="Heading2Char"/>
+        </w:rPr>
+        <w:t>For context:</w:t>
+      </w:r>
+      <w:r>
+        <w:br/>
+      </w:r>
+      <w:r>
+        <w:t>As AI was used in this project, I want to clarify that this is not my first design or development project as I have 16 years of experience as a professional designer, 13 as a web</w:t>
+      </w:r>
+      <w:r>
+        <w:t xml:space="preserve"> </w:t>
+      </w:r>
+      <w:r>
+        <w:t>designer (Word</w:t>
+      </w:r>
+      <w:r>
+        <w:t>P</w:t>
+      </w:r>
+      <w:r>
+        <w:t xml:space="preserve">ress) and </w:t>
+      </w:r>
+      <w:r>
+        <w:t xml:space="preserve">4 years as a developer </w:t>
+      </w:r>
+      <w:r>
+        <w:t xml:space="preserve">with </w:t>
+      </w:r>
+      <w:proofErr w:type="spellStart"/>
+      <w:r>
+        <w:t>javascript</w:t>
+      </w:r>
+      <w:proofErr w:type="spellEnd"/>
+      <w:r>
+        <w:t>,</w:t>
+      </w:r>
+      <w:r>
+        <w:t xml:space="preserve"> typescript,</w:t>
+      </w:r>
+      <w:r>
+        <w:t xml:space="preserve"> react and other languages. Before starting </w:t>
+      </w:r>
+      <w:r>
+        <w:t>at</w:t>
+      </w:r>
+      <w:r>
+        <w:t xml:space="preserve"> ATU I had already built and delivered real world projects.</w:t>
+      </w:r>
+    </w:p>
+    <w:p>
+      <w:r>
+        <w:t>Part of the code will have more advanced structures than the ones we were taught in class</w:t>
+      </w:r>
+      <w:r>
+        <w:t xml:space="preserve"> but every snippet that was used from somebody else</w:t>
+      </w:r>
+      <w:r>
+        <w:t>’s</w:t>
+      </w:r>
+      <w:r>
+        <w:t xml:space="preserve"> code </w:t>
+      </w:r>
+      <w:r>
+        <w:t>is</w:t>
+      </w:r>
+      <w:r>
+        <w:t xml:space="preserve"> addressed in the project code and at the end of this document.</w:t>
+      </w:r>
+    </w:p>
+    <w:p>
+      <w:r>
+        <w:t>Mauricio holds the following certificates:</w:t>
+      </w:r>
+    </w:p>
+    <w:tbl>
+      <w:tblPr>
+        <w:tblStyle w:val="TableGrid"/>
+        <w:tblW w:w="10705" w:type="dxa"/>
+        <w:tblLook w:val="04A0" w:firstRow="1" w:lastRow="0" w:firstColumn="1" w:lastColumn="0" w:noHBand="0" w:noVBand="1"/>
+      </w:tblPr>
+      <w:tblGrid>
+        <w:gridCol w:w="4495"/>
+        <w:gridCol w:w="6210"/>
+      </w:tblGrid>
+      <w:tr>
+        <w:tc>
+          <w:tcPr>
+            <w:tcW w:w="4495" w:type="dxa"/>
+          </w:tcPr>
+          <w:p>
+            <w:r>
+              <w:t>Design</w:t>
+            </w:r>
+          </w:p>
+        </w:tc>
+        <w:tc>
+          <w:tcPr>
+            <w:tcW w:w="6210" w:type="dxa"/>
+          </w:tcPr>
+          <w:p>
+            <w:r>
+              <w:t>Development</w:t>
+            </w:r>
+          </w:p>
+        </w:tc>
+      </w:tr>
+      <w:tr>
+        <w:tc>
+          <w:tcPr>
+            <w:tcW w:w="4495" w:type="dxa"/>
+          </w:tcPr>
+          <w:p>
+            <w:r>
+              <w:t>Adobe Certified Expert Illustrator</w:t>
+            </w:r>
+            <w:r>
+              <w:t xml:space="preserve"> (201</w:t>
+            </w:r>
+            <w:r>
+              <w:t>0</w:t>
+            </w:r>
+            <w:r>
+              <w:t>)</w:t>
+            </w:r>
+            <w:r>
+              <w:br/>
+              <w:t>Adobe Certified Expert Photoshop</w:t>
+            </w:r>
+            <w:r>
+              <w:t xml:space="preserve"> </w:t>
+            </w:r>
+            <w:r>
+              <w:t>(2010)</w:t>
+            </w:r>
+            <w:r>
+              <w:br/>
+              <w:t>Adobe Certified Expert InDesign</w:t>
+            </w:r>
+            <w:r>
+              <w:t xml:space="preserve"> </w:t>
+            </w:r>
+            <w:r>
+              <w:t>(201</w:t>
+            </w:r>
+            <w:r>
+              <w:t>2</w:t>
+            </w:r>
+            <w:r>
+              <w:t>)</w:t>
+            </w:r>
+            <w:r>
+              <w:br/>
+              <w:t>Adobe Certified Expert Acrobat x</w:t>
+            </w:r>
+            <w:r>
+              <w:t xml:space="preserve"> </w:t>
+            </w:r>
+            <w:r>
+              <w:t>(2012)</w:t>
+            </w:r>
+            <w:r>
+              <w:br/>
+              <w:t>Adobe Certified Design Specialist</w:t>
+            </w:r>
+            <w:r>
+              <w:t xml:space="preserve"> </w:t>
+            </w:r>
+            <w:r>
+              <w:t>(2012)</w:t>
+            </w:r>
+            <w:r>
+              <w:br/>
+              <w:t>Adobe Certified Design Master</w:t>
+            </w:r>
+            <w:r>
+              <w:t xml:space="preserve"> </w:t>
+            </w:r>
+            <w:r>
+              <w:t>(2012)</w:t>
+            </w:r>
+          </w:p>
+        </w:tc>
+        <w:tc>
+          <w:tcPr>
+            <w:tcW w:w="6210" w:type="dxa"/>
+          </w:tcPr>
+          <w:p>
+            <w:pPr>
+              <w:numPr>
+                <w:ilvl w:val="0"/>
+                <w:numId w:val="6"/>
+              </w:numPr>
+            </w:pPr>
+            <w:r>
+              <w:t>The Modern JavaScript Bootcamp</w:t>
+            </w:r>
+            <w:r>
+              <w:br/>
+              <w:t>Udemy (2022)</w:t>
+            </w:r>
+          </w:p>
+          <w:p>
+            <w:pPr>
+              <w:numPr>
+                <w:ilvl w:val="0"/>
+                <w:numId w:val="6"/>
+              </w:numPr>
+            </w:pPr>
+            <w:r>
+              <w:t xml:space="preserve">ES6 </w:t>
+            </w:r>
+            <w:proofErr w:type="spellStart"/>
+            <w:r>
+              <w:t>Javascript</w:t>
+            </w:r>
+            <w:proofErr w:type="spellEnd"/>
+            <w:r>
+              <w:t>: The complete Developer’s Guide</w:t>
+            </w:r>
+            <w:r>
+              <w:br/>
+              <w:t>Udemy (2022)</w:t>
+            </w:r>
+          </w:p>
+          <w:p>
+            <w:pPr>
+              <w:numPr>
+                <w:ilvl w:val="0"/>
+                <w:numId w:val="6"/>
+              </w:numPr>
+            </w:pPr>
+            <w:r>
+              <w:t>Modern React with Redux [2023 Update]</w:t>
+            </w:r>
+            <w:r>
+              <w:br/>
+              <w:t>Udemy (2022)</w:t>
+            </w:r>
+          </w:p>
+          <w:p>
+            <w:pPr>
+              <w:numPr>
+                <w:ilvl w:val="0"/>
+                <w:numId w:val="6"/>
+              </w:numPr>
+            </w:pPr>
+            <w:r>
+              <w:t>The Complete React Native + Hooks Course</w:t>
+            </w:r>
+            <w:r>
+              <w:br/>
+              <w:t>Udemy (2022)</w:t>
+            </w:r>
+          </w:p>
+          <w:p>
+            <w:pPr>
+              <w:numPr>
+                <w:ilvl w:val="0"/>
+                <w:numId w:val="6"/>
+              </w:numPr>
+            </w:pPr>
+            <w:r>
+              <w:t>Typescript - The Complete Developer’s Guide</w:t>
+            </w:r>
+            <w:r>
+              <w:br/>
+              <w:t>Udemy (2022)</w:t>
+            </w:r>
+          </w:p>
+          <w:p>
+            <w:pPr>
+              <w:pStyle w:val="ListParagraph"/>
+              <w:numPr>
+                <w:ilvl w:val="0"/>
+                <w:numId w:val="6"/>
+              </w:numPr>
+            </w:pPr>
+            <w:r>
+              <w:t>Meta Certified Web Developer</w:t>
+            </w:r>
+            <w:r>
+              <w:t xml:space="preserve"> </w:t>
+            </w:r>
+            <w:r>
+              <w:t>(2023)</w:t>
+            </w:r>
+          </w:p>
+          <w:p>
+            <w:pPr>
+              <w:pStyle w:val="ListParagraph"/>
+              <w:numPr>
+                <w:ilvl w:val="0"/>
+                <w:numId w:val="6"/>
+              </w:numPr>
+            </w:pPr>
+            <w:r>
+              <w:t xml:space="preserve">Anthropic </w:t>
+            </w:r>
+            <w:r>
+              <w:t>AI Fluency for students</w:t>
+            </w:r>
+            <w:r>
+              <w:t xml:space="preserve"> (2026)</w:t>
+            </w:r>
+          </w:p>
+          <w:p/>
+        </w:tc>
+      </w:tr>
+    </w:tbl>
+    <w:p/>
+    <w:p>
       <w:pPr>
         <w:pStyle w:val="Heading2"/>
       </w:pPr>
       <w:r>
+        <w:lastRenderedPageBreak/>
         <w:t>Roles</w:t>
       </w:r>
     </w:p>
@@ -95,8 +460,13 @@
         </w:numPr>
       </w:pPr>
       <w:r>
-        <w:t>Built the home page — hero section, featured grid, save to localStorage</w:t>
-      </w:r>
+        <w:t xml:space="preserve">Built the home page — hero section, featured grid, save to </w:t>
+      </w:r>
+      <w:proofErr w:type="spellStart"/>
+      <w:r>
+        <w:t>localStorage</w:t>
+      </w:r>
+      <w:proofErr w:type="spellEnd"/>
     </w:p>
     <w:p>
       <w:pPr>
@@ -119,8 +489,13 @@
         </w:numPr>
       </w:pPr>
       <w:r>
-        <w:t>Wrote all JavaScript logic on the browse page — live filtering and search</w:t>
-      </w:r>
+        <w:t xml:space="preserve">Wrote all JavaScript logic on the browse page — live filtering and </w:t>
+      </w:r>
+      <w:proofErr w:type="gramStart"/>
+      <w:r>
+        <w:t>search</w:t>
+      </w:r>
+      <w:proofErr w:type="gramEnd"/>
     </w:p>
     <w:p>
       <w:pPr>
@@ -195,7 +570,15 @@
         </w:numPr>
       </w:pPr>
       <w:r>
-        <w:t>Sole owner of the saved tools page — HTML structure, localStorage read/render, remove functionality, empty state</w:t>
+        <w:t xml:space="preserve">Sole owner of the saved tools page — HTML structure, </w:t>
+      </w:r>
+      <w:proofErr w:type="spellStart"/>
+      <w:r>
+        <w:t>localStorage</w:t>
+      </w:r>
+      <w:proofErr w:type="spellEnd"/>
+      <w:r>
+        <w:t xml:space="preserve"> read/render, remove functionality, empty state</w:t>
       </w:r>
     </w:p>
     <w:p>
@@ -316,7 +699,23 @@
         <w:t xml:space="preserve">development </w:t>
       </w:r>
       <w:r>
-        <w:t>progress tracking system —progress.json+ GitHub Actions workflow with commit message convention</w:t>
+        <w:t>progress tracking system —</w:t>
+      </w:r>
+      <w:r>
+        <w:t xml:space="preserve"> </w:t>
+      </w:r>
+      <w:proofErr w:type="spellStart"/>
+      <w:proofErr w:type="gramStart"/>
+      <w:r>
+        <w:t>progress.json</w:t>
+      </w:r>
+      <w:proofErr w:type="spellEnd"/>
+      <w:proofErr w:type="gramEnd"/>
+      <w:r>
+        <w:t xml:space="preserve"> </w:t>
+      </w:r>
+      <w:r>
+        <w:t>+ GitHub Actions workflow with commit message convention</w:t>
       </w:r>
       <w:r>
         <w:t xml:space="preserve"> (Extra organizational step </w:t>
@@ -337,7 +736,6 @@
         </w:numPr>
       </w:pPr>
       <w:r>
-        <w:lastRenderedPageBreak/>
         <w:t>Built the project guide (guide.html), overview page, and git reference — all internal tooling</w:t>
       </w:r>
       <w:r>
@@ -372,58 +770,6 @@
       </w:r>
     </w:p>
     <w:p/>
-    <w:p/>
-    <w:p>
-      <w:pPr>
-        <w:pStyle w:val="Heading2"/>
-      </w:pPr>
-      <w:r>
-        <w:t>AI use in the project:</w:t>
-      </w:r>
-    </w:p>
-    <w:p>
-      <w:r>
-        <w:t>To</w:t>
-      </w:r>
-      <w:r>
-        <w:t xml:space="preserve"> simulate a real development workflow. Since the project does not require us to come up with the design choices, Mauricio used Claude AI to help define the non-coding aspects o</w:t>
-      </w:r>
-      <w:r>
-        <w:t>f</w:t>
-      </w:r>
-      <w:r>
-        <w:t xml:space="preserve"> this project</w:t>
-      </w:r>
-      <w:r>
-        <w:t xml:space="preserve"> as Claude was the </w:t>
-      </w:r>
-      <w:r>
-        <w:t>Tech Lean</w:t>
-      </w:r>
-      <w:r>
-        <w:t xml:space="preserve"> and we were the developers</w:t>
-      </w:r>
-      <w:r>
-        <w:t>.</w:t>
-      </w:r>
-    </w:p>
-    <w:p>
-      <w:pPr>
-        <w:pStyle w:val="Heading4"/>
-      </w:pPr>
-      <w:r>
-        <w:t>The original AI designed page is in the repository: /images/page-ui.png</w:t>
-      </w:r>
-    </w:p>
-    <w:p>
-      <w:pPr>
-        <w:pStyle w:val="Heading4"/>
-      </w:pPr>
-      <w:r>
-        <w:t>The differences between the original design and the final result were deliberate choices made during the development.</w:t>
-      </w:r>
-    </w:p>
-    <w:p/>
     <w:p>
       <w:pPr>
         <w:pStyle w:val="Heading2"/>
@@ -482,8 +828,13 @@
       <w:r>
         <w:t xml:space="preserve">All </w:t>
       </w:r>
-      <w:r>
-        <w:t>css files</w:t>
+      <w:proofErr w:type="spellStart"/>
+      <w:r>
+        <w:t>css</w:t>
+      </w:r>
+      <w:proofErr w:type="spellEnd"/>
+      <w:r>
+        <w:t xml:space="preserve"> files</w:t>
       </w:r>
     </w:p>
     <w:p>
@@ -495,10 +846,16 @@
         </w:numPr>
       </w:pPr>
       <w:r>
+        <w:lastRenderedPageBreak/>
         <w:t xml:space="preserve">All </w:t>
       </w:r>
-      <w:r>
-        <w:t>js files</w:t>
+      <w:proofErr w:type="spellStart"/>
+      <w:r>
+        <w:t>js</w:t>
+      </w:r>
+      <w:proofErr w:type="spellEnd"/>
+      <w:r>
+        <w:t xml:space="preserve"> files</w:t>
       </w:r>
     </w:p>
     <w:p>
@@ -598,14 +955,13 @@
         <w:pStyle w:val="Heading3"/>
       </w:pPr>
       <w:r>
-        <w:lastRenderedPageBreak/>
         <w:t>Code snippets:</w:t>
       </w:r>
     </w:p>
     <w:p/>
     <w:sectPr>
       <w:pgSz w:w="12240" w:h="15840"/>
-      <w:pgMar w:top="1440" w:right="1440" w:bottom="1440" w:left="1440" w:header="720" w:footer="720" w:gutter="0"/>
+      <w:pgMar w:top="720" w:right="720" w:bottom="720" w:left="720" w:header="720" w:footer="720" w:gutter="0"/>
       <w:cols w:space="720"/>
       <w:docGrid w:linePitch="360"/>
     </w:sectPr>
@@ -616,6 +972,155 @@
 <file path=word/numbering.xml><?xml version="1.0" encoding="utf-8"?>
 <w:numbering xmlns:wpc="http://schemas.microsoft.com/office/word/2010/wordprocessingCanvas" xmlns:cx="http://schemas.microsoft.com/office/drawing/2014/chartex" xmlns:cx1="http://schemas.microsoft.com/office/drawing/2015/9/8/chartex" xmlns:cx2="http://schemas.microsoft.com/office/drawing/2015/10/21/chartex" xmlns:cx3="http://schemas.microsoft.com/office/drawing/2016/5/9/chartex" xmlns:cx4="http://schemas.microsoft.com/office/drawing/2016/5/10/chartex" xmlns:cx5="http://schemas.microsoft.com/office/drawing/2016/5/11/chartex" xmlns:cx6="http://schemas.microsoft.com/office/drawing/2016/5/12/chartex" xmlns:cx7="http://schemas.microsoft.com/office/drawing/2016/5/13/chartex" xmlns:cx8="http://schemas.microsoft.com/office/drawing/2016/5/14/chartex" xmlns:mc="http://schemas.openxmlformats.org/markup-compatibility/2006" xmlns:aink="http://schemas.microsoft.com/office/drawing/2016/ink" xmlns:am3d="http://schemas.microsoft.com/office/drawing/2017/model3d" xmlns:o="urn:schemas-microsoft-com:office:office" xmlns:oel="http://schemas.microsoft.com/office/2019/extlst" xmlns:r="http://schemas.openxmlformats.org/officeDocument/2006/relationships" xmlns:m="http://schemas.openxmlformats.org/officeDocument/2006/math" xmlns:v="urn:schemas-microsoft-com:vml" xmlns:wp14="http://schemas.microsoft.com/office/word/2010/wordprocessingDrawing" xmlns:wp="http://schemas.openxmlformats.org/drawingml/2006/wordprocessingDrawing" xmlns:w10="urn:schemas-microsoft-com:office:word" xmlns:w="http://schemas.openxmlformats.org/wordprocessingml/2006/main" xmlns:w14="http://schemas.microsoft.com/office/word/2010/wordml" xmlns:w15="http://schemas.microsoft.com/office/word/2012/wordml" xmlns:w16cex="http://schemas.microsoft.com/office/word/2018/wordml/cex" xmlns:w16cid="http://schemas.microsoft.com/office/word/2016/wordml/cid" xmlns:w16="http://schemas.microsoft.com/office/word/2018/wordml" xmlns:w16du="http://schemas.microsoft.com/office/word/2023/wordml/word16du" xmlns:w16sdtdh="http://schemas.microsoft.com/office/word/2020/wordml/sdtdatahash" xmlns:w16sdtfl="http://schemas.microsoft.com/office/word/2024/wordml/sdtformatlock" xmlns:w16se="http://schemas.microsoft.com/office/word/2015/wordml/symex" xmlns:wpg="http://schemas.microsoft.com/office/word/2010/wordprocessingGroup" xmlns:wpi="http://schemas.microsoft.com/office/word/2010/wordprocessingInk" xmlns:wne="http://schemas.microsoft.com/office/word/2006/wordml" xmlns:wps="http://schemas.microsoft.com/office/word/2010/wordprocessingShape" mc:Ignorable="w14 w15 w16se w16cid w16 w16cex w16sdtdh w16sdtfl w16du wp14">
   <w:abstractNum w:abstractNumId="0" w15:restartNumberingAfterBreak="0">
+    <w:nsid w:val="130D1C5C"/>
+    <w:multiLevelType w:val="multilevel"/>
+    <w:tmpl w:val="4C803BCA"/>
+    <w:lvl w:ilvl="0">
+      <w:start w:val="1"/>
+      <w:numFmt w:val="bullet"/>
+      <w:lvlText w:val=""/>
+      <w:lvlJc w:val="left"/>
+      <w:pPr>
+        <w:tabs>
+          <w:tab w:val="num" w:pos="720"/>
+        </w:tabs>
+        <w:ind w:left="720" w:hanging="360"/>
+      </w:pPr>
+      <w:rPr>
+        <w:rFonts w:ascii="Symbol" w:hAnsi="Symbol" w:hint="default"/>
+        <w:sz w:val="20"/>
+      </w:rPr>
+    </w:lvl>
+    <w:lvl w:ilvl="1" w:tentative="1">
+      <w:start w:val="1"/>
+      <w:numFmt w:val="bullet"/>
+      <w:lvlText w:val="o"/>
+      <w:lvlJc w:val="left"/>
+      <w:pPr>
+        <w:tabs>
+          <w:tab w:val="num" w:pos="1440"/>
+        </w:tabs>
+        <w:ind w:left="1440" w:hanging="360"/>
+      </w:pPr>
+      <w:rPr>
+        <w:rFonts w:ascii="Courier New" w:hAnsi="Courier New" w:hint="default"/>
+        <w:sz w:val="20"/>
+      </w:rPr>
+    </w:lvl>
+    <w:lvl w:ilvl="2" w:tentative="1">
+      <w:start w:val="1"/>
+      <w:numFmt w:val="bullet"/>
+      <w:lvlText w:val=""/>
+      <w:lvlJc w:val="left"/>
+      <w:pPr>
+        <w:tabs>
+          <w:tab w:val="num" w:pos="2160"/>
+        </w:tabs>
+        <w:ind w:left="2160" w:hanging="360"/>
+      </w:pPr>
+      <w:rPr>
+        <w:rFonts w:ascii="Wingdings" w:hAnsi="Wingdings" w:hint="default"/>
+        <w:sz w:val="20"/>
+      </w:rPr>
+    </w:lvl>
+    <w:lvl w:ilvl="3" w:tentative="1">
+      <w:start w:val="1"/>
+      <w:numFmt w:val="bullet"/>
+      <w:lvlText w:val=""/>
+      <w:lvlJc w:val="left"/>
+      <w:pPr>
+        <w:tabs>
+          <w:tab w:val="num" w:pos="2880"/>
+        </w:tabs>
+        <w:ind w:left="2880" w:hanging="360"/>
+      </w:pPr>
+      <w:rPr>
+        <w:rFonts w:ascii="Wingdings" w:hAnsi="Wingdings" w:hint="default"/>
+        <w:sz w:val="20"/>
+      </w:rPr>
+    </w:lvl>
+    <w:lvl w:ilvl="4" w:tentative="1">
+      <w:start w:val="1"/>
+      <w:numFmt w:val="bullet"/>
+      <w:lvlText w:val=""/>
+      <w:lvlJc w:val="left"/>
+      <w:pPr>
+        <w:tabs>
+          <w:tab w:val="num" w:pos="3600"/>
+        </w:tabs>
+        <w:ind w:left="3600" w:hanging="360"/>
+      </w:pPr>
+      <w:rPr>
+        <w:rFonts w:ascii="Wingdings" w:hAnsi="Wingdings" w:hint="default"/>
+        <w:sz w:val="20"/>
+      </w:rPr>
+    </w:lvl>
+    <w:lvl w:ilvl="5" w:tentative="1">
+      <w:start w:val="1"/>
+      <w:numFmt w:val="bullet"/>
+      <w:lvlText w:val=""/>
+      <w:lvlJc w:val="left"/>
+      <w:pPr>
+        <w:tabs>
+          <w:tab w:val="num" w:pos="4320"/>
+        </w:tabs>
+        <w:ind w:left="4320" w:hanging="360"/>
+      </w:pPr>
+      <w:rPr>
+        <w:rFonts w:ascii="Wingdings" w:hAnsi="Wingdings" w:hint="default"/>
+        <w:sz w:val="20"/>
+      </w:rPr>
+    </w:lvl>
+    <w:lvl w:ilvl="6" w:tentative="1">
+      <w:start w:val="1"/>
+      <w:numFmt w:val="bullet"/>
+      <w:lvlText w:val=""/>
+      <w:lvlJc w:val="left"/>
+      <w:pPr>
+        <w:tabs>
+          <w:tab w:val="num" w:pos="5040"/>
+        </w:tabs>
+        <w:ind w:left="5040" w:hanging="360"/>
+      </w:pPr>
+      <w:rPr>
+        <w:rFonts w:ascii="Wingdings" w:hAnsi="Wingdings" w:hint="default"/>
+        <w:sz w:val="20"/>
+      </w:rPr>
+    </w:lvl>
+    <w:lvl w:ilvl="7" w:tentative="1">
+      <w:start w:val="1"/>
+      <w:numFmt w:val="bullet"/>
+      <w:lvlText w:val=""/>
+      <w:lvlJc w:val="left"/>
+      <w:pPr>
+        <w:tabs>
+          <w:tab w:val="num" w:pos="5760"/>
+        </w:tabs>
+        <w:ind w:left="5760" w:hanging="360"/>
+      </w:pPr>
+      <w:rPr>
+        <w:rFonts w:ascii="Wingdings" w:hAnsi="Wingdings" w:hint="default"/>
+        <w:sz w:val="20"/>
+      </w:rPr>
+    </w:lvl>
+    <w:lvl w:ilvl="8" w:tentative="1">
+      <w:start w:val="1"/>
+      <w:numFmt w:val="bullet"/>
+      <w:lvlText w:val=""/>
+      <w:lvlJc w:val="left"/>
+      <w:pPr>
+        <w:tabs>
+          <w:tab w:val="num" w:pos="6480"/>
+        </w:tabs>
+        <w:ind w:left="6480" w:hanging="360"/>
+      </w:pPr>
+      <w:rPr>
+        <w:rFonts w:ascii="Wingdings" w:hAnsi="Wingdings" w:hint="default"/>
+        <w:sz w:val="20"/>
+      </w:rPr>
+    </w:lvl>
+  </w:abstractNum>
+  <w:abstractNum w:abstractNumId="1" w15:restartNumberingAfterBreak="0">
     <w:nsid w:val="2CC12E8C"/>
     <w:multiLevelType w:val="hybridMultilevel"/>
     <w:tmpl w:val="D52A6512"/>
@@ -728,7 +1233,7 @@
       </w:rPr>
     </w:lvl>
   </w:abstractNum>
-  <w:abstractNum w:abstractNumId="1" w15:restartNumberingAfterBreak="0">
+  <w:abstractNum w:abstractNumId="2" w15:restartNumberingAfterBreak="0">
     <w:nsid w:val="4BFB1CBB"/>
     <w:multiLevelType w:val="hybridMultilevel"/>
     <w:tmpl w:val="F572BDBE"/>
@@ -841,7 +1346,7 @@
       </w:rPr>
     </w:lvl>
   </w:abstractNum>
-  <w:abstractNum w:abstractNumId="2" w15:restartNumberingAfterBreak="0">
+  <w:abstractNum w:abstractNumId="3" w15:restartNumberingAfterBreak="0">
     <w:nsid w:val="4FCF7B2D"/>
     <w:multiLevelType w:val="hybridMultilevel"/>
     <w:tmpl w:val="5F5CA4D8"/>
@@ -954,7 +1459,7 @@
       </w:rPr>
     </w:lvl>
   </w:abstractNum>
-  <w:abstractNum w:abstractNumId="3" w15:restartNumberingAfterBreak="0">
+  <w:abstractNum w:abstractNumId="4" w15:restartNumberingAfterBreak="0">
     <w:nsid w:val="5B9645DD"/>
     <w:multiLevelType w:val="hybridMultilevel"/>
     <w:tmpl w:val="B9569E12"/>
@@ -1067,7 +1572,7 @@
       </w:rPr>
     </w:lvl>
   </w:abstractNum>
-  <w:abstractNum w:abstractNumId="4" w15:restartNumberingAfterBreak="0">
+  <w:abstractNum w:abstractNumId="5" w15:restartNumberingAfterBreak="0">
     <w:nsid w:val="61B5347E"/>
     <w:multiLevelType w:val="hybridMultilevel"/>
     <w:tmpl w:val="F0AECEF8"/>
@@ -1181,19 +1686,22 @@
     </w:lvl>
   </w:abstractNum>
   <w:num w:numId="1" w16cid:durableId="560019821">
+    <w:abstractNumId w:val="3"/>
+  </w:num>
+  <w:num w:numId="2" w16cid:durableId="82842363">
     <w:abstractNumId w:val="2"/>
   </w:num>
-  <w:num w:numId="2" w16cid:durableId="82842363">
+  <w:num w:numId="3" w16cid:durableId="1919634846">
+    <w:abstractNumId w:val="5"/>
+  </w:num>
+  <w:num w:numId="4" w16cid:durableId="1520579508">
     <w:abstractNumId w:val="1"/>
   </w:num>
-  <w:num w:numId="3" w16cid:durableId="1919634846">
+  <w:num w:numId="5" w16cid:durableId="750466954">
     <w:abstractNumId w:val="4"/>
   </w:num>
-  <w:num w:numId="4" w16cid:durableId="1520579508">
+  <w:num w:numId="6" w16cid:durableId="49548108">
     <w:abstractNumId w:val="0"/>
-  </w:num>
-  <w:num w:numId="5" w16cid:durableId="750466954">
-    <w:abstractNumId w:val="3"/>
   </w:num>
 </w:numbering>
 </file>
@@ -2132,6 +2640,25 @@
       <w:shd w:val="clear" w:color="auto" w:fill="E1DFDD"/>
     </w:rPr>
   </w:style>
+  <w:style w:type="table" w:styleId="TableGrid">
+    <w:name w:val="Table Grid"/>
+    <w:basedOn w:val="TableNormal"/>
+    <w:uiPriority w:val="39"/>
+    <w:rsid w:val="00A738AF"/>
+    <w:pPr>
+      <w:spacing w:after="0" w:line="240" w:lineRule="auto"/>
+    </w:pPr>
+    <w:tblPr>
+      <w:tblBorders>
+        <w:top w:val="single" w:sz="4" w:space="0" w:color="auto"/>
+        <w:left w:val="single" w:sz="4" w:space="0" w:color="auto"/>
+        <w:bottom w:val="single" w:sz="4" w:space="0" w:color="auto"/>
+        <w:right w:val="single" w:sz="4" w:space="0" w:color="auto"/>
+        <w:insideH w:val="single" w:sz="4" w:space="0" w:color="auto"/>
+        <w:insideV w:val="single" w:sz="4" w:space="0" w:color="auto"/>
+      </w:tblBorders>
+    </w:tblPr>
+  </w:style>
 </w:styles>
 </file>
 

</xml_diff>

<commit_message>
Added content to main page + js files + html appened with js links
</commit_message>
<xml_diff>
--- a/Project Neural AI.docx
+++ b/Project Neural AI.docx
@@ -5,8 +5,16 @@
     <w:p>
       <w:pPr>
         <w:pStyle w:val="Heading1"/>
-      </w:pPr>
-      <w:r>
+        <w:rPr>
+          <w:sz w:val="144"/>
+          <w:szCs w:val="144"/>
+        </w:rPr>
+      </w:pPr>
+      <w:r>
+        <w:rPr>
+          <w:sz w:val="144"/>
+          <w:szCs w:val="144"/>
+        </w:rPr>
         <w:t>Project Neural AI</w:t>
       </w:r>
     </w:p>
@@ -17,10 +25,7 @@
     </w:p>
     <w:p>
       <w:r>
-        <w:t>Group members:</w:t>
-      </w:r>
-      <w:r>
-        <w:t xml:space="preserve"> Mauricio Rodriguez and Eamonn Corban</w:t>
+        <w:t>Group members: Mauricio Rodriguez and Eamonn Corban</w:t>
       </w:r>
     </w:p>
     <w:p>
@@ -33,7 +38,19 @@
     </w:p>
     <w:p>
       <w:r>
-        <w:t>To simulate a real development workflow. Since the project does not require us to come up with the design choices, Mauricio used Claude AI to help define the non-coding aspects of this project as Claude was the Tech Lean and we were the developers.</w:t>
+        <w:t xml:space="preserve">To simulate a real development workflow. Since the project does not require us to come up with the design choices, </w:t>
+      </w:r>
+      <w:r>
+        <w:t>I</w:t>
+      </w:r>
+      <w:r>
+        <w:t xml:space="preserve"> used Claude AI to help define the non-coding aspects of this project as</w:t>
+      </w:r>
+      <w:r>
+        <w:t xml:space="preserve"> if</w:t>
+      </w:r>
+      <w:r>
+        <w:t xml:space="preserve"> Claude was the Tech Lean and we were the developers.</w:t>
       </w:r>
     </w:p>
     <w:p>
@@ -49,15 +66,7 @@
         <w:pStyle w:val="Heading4"/>
       </w:pPr>
       <w:r>
-        <w:t xml:space="preserve">The differences between the original design and </w:t>
-      </w:r>
-      <w:proofErr w:type="gramStart"/>
-      <w:r>
-        <w:t>the final result</w:t>
-      </w:r>
-      <w:proofErr w:type="gramEnd"/>
-      <w:r>
-        <w:t xml:space="preserve"> were deliberate choices made during the development to follow the </w:t>
+        <w:t xml:space="preserve">The differences between the original design and the final result were deliberate choices made during the development to follow the </w:t>
       </w:r>
       <w:r>
         <w:t>Student Code of Conduct</w:t>
@@ -96,13 +105,8 @@
         <w:t xml:space="preserve">4 years as a developer </w:t>
       </w:r>
       <w:r>
-        <w:t xml:space="preserve">with </w:t>
-      </w:r>
-      <w:proofErr w:type="spellStart"/>
-      <w:r>
-        <w:t>javascript</w:t>
-      </w:r>
-      <w:proofErr w:type="spellEnd"/>
+        <w:t>with javascript</w:t>
+      </w:r>
       <w:r>
         <w:t>,</w:t>
       </w:r>
@@ -199,56 +203,35 @@
               <w:t>Adobe Certified Expert Photoshop</w:t>
             </w:r>
             <w:r>
-              <w:t xml:space="preserve"> </w:t>
-            </w:r>
-            <w:r>
-              <w:t>(2010)</w:t>
+              <w:t xml:space="preserve"> (2010)</w:t>
             </w:r>
             <w:r>
               <w:br/>
               <w:t>Adobe Certified Expert InDesign</w:t>
             </w:r>
             <w:r>
-              <w:t xml:space="preserve"> </w:t>
-            </w:r>
-            <w:r>
-              <w:t>(201</w:t>
-            </w:r>
-            <w:r>
-              <w:t>2</w:t>
-            </w:r>
-            <w:r>
-              <w:t>)</w:t>
+              <w:t xml:space="preserve"> (2012)</w:t>
             </w:r>
             <w:r>
               <w:br/>
               <w:t>Adobe Certified Expert Acrobat x</w:t>
             </w:r>
             <w:r>
-              <w:t xml:space="preserve"> </w:t>
-            </w:r>
-            <w:r>
-              <w:t>(2012)</w:t>
+              <w:t xml:space="preserve"> (2012)</w:t>
             </w:r>
             <w:r>
               <w:br/>
               <w:t>Adobe Certified Design Specialist</w:t>
             </w:r>
             <w:r>
-              <w:t xml:space="preserve"> </w:t>
-            </w:r>
-            <w:r>
-              <w:t>(2012)</w:t>
+              <w:t xml:space="preserve"> (2012)</w:t>
             </w:r>
             <w:r>
               <w:br/>
               <w:t>Adobe Certified Design Master</w:t>
             </w:r>
             <w:r>
-              <w:t xml:space="preserve"> </w:t>
-            </w:r>
-            <w:r>
-              <w:t>(2012)</w:t>
+              <w:t xml:space="preserve"> (2012)</w:t>
             </w:r>
           </w:p>
         </w:tc>
@@ -279,15 +262,7 @@
               </w:numPr>
             </w:pPr>
             <w:r>
-              <w:t xml:space="preserve">ES6 </w:t>
-            </w:r>
-            <w:proofErr w:type="spellStart"/>
-            <w:r>
-              <w:t>Javascript</w:t>
-            </w:r>
-            <w:proofErr w:type="spellEnd"/>
-            <w:r>
-              <w:t>: The complete Developer’s Guide</w:t>
+              <w:t>ES6 Javascript: The complete Developer’s Guide</w:t>
             </w:r>
             <w:r>
               <w:br/>
@@ -348,13 +323,7 @@
               </w:numPr>
             </w:pPr>
             <w:r>
-              <w:t>Meta Certified Web Developer</w:t>
-            </w:r>
-            <w:r>
-              <w:t xml:space="preserve"> </w:t>
-            </w:r>
-            <w:r>
-              <w:t>(2023)</w:t>
+              <w:t>Meta Certified Web Developer (2023)</w:t>
             </w:r>
           </w:p>
           <w:p>
@@ -385,7 +354,6 @@
         <w:pStyle w:val="Heading2"/>
       </w:pPr>
       <w:r>
-        <w:lastRenderedPageBreak/>
         <w:t>Roles</w:t>
       </w:r>
     </w:p>
@@ -460,13 +428,8 @@
         </w:numPr>
       </w:pPr>
       <w:r>
-        <w:t xml:space="preserve">Built the home page — hero section, featured grid, save to </w:t>
-      </w:r>
-      <w:proofErr w:type="spellStart"/>
-      <w:r>
-        <w:t>localStorage</w:t>
-      </w:r>
-      <w:proofErr w:type="spellEnd"/>
+        <w:t>Built the home page — hero section, featured grid, save to localStorage</w:t>
+      </w:r>
     </w:p>
     <w:p>
       <w:pPr>
@@ -489,13 +452,8 @@
         </w:numPr>
       </w:pPr>
       <w:r>
-        <w:t xml:space="preserve">Wrote all JavaScript logic on the browse page — live filtering and </w:t>
-      </w:r>
-      <w:proofErr w:type="gramStart"/>
-      <w:r>
-        <w:t>search</w:t>
-      </w:r>
-      <w:proofErr w:type="gramEnd"/>
+        <w:t>Wrote all JavaScript logic on the browse page — live filtering and search</w:t>
+      </w:r>
     </w:p>
     <w:p>
       <w:pPr>
@@ -570,15 +528,7 @@
         </w:numPr>
       </w:pPr>
       <w:r>
-        <w:t xml:space="preserve">Sole owner of the saved tools page — HTML structure, </w:t>
-      </w:r>
-      <w:proofErr w:type="spellStart"/>
-      <w:r>
-        <w:t>localStorage</w:t>
-      </w:r>
-      <w:proofErr w:type="spellEnd"/>
-      <w:r>
-        <w:t xml:space="preserve"> read/render, remove functionality, empty state</w:t>
+        <w:t>Sole owner of the saved tools page — HTML structure, localStorage read/render, remove functionality, empty state</w:t>
       </w:r>
     </w:p>
     <w:p>
@@ -704,13 +654,9 @@
       <w:r>
         <w:t xml:space="preserve"> </w:t>
       </w:r>
-      <w:proofErr w:type="spellStart"/>
-      <w:proofErr w:type="gramStart"/>
       <w:r>
         <w:t>progress.json</w:t>
       </w:r>
-      <w:proofErr w:type="spellEnd"/>
-      <w:proofErr w:type="gramEnd"/>
       <w:r>
         <w:t xml:space="preserve"> </w:t>
       </w:r>
@@ -811,6 +757,7 @@
         </w:numPr>
       </w:pPr>
       <w:r>
+        <w:lastRenderedPageBreak/>
         <w:t xml:space="preserve">All </w:t>
       </w:r>
       <w:r>
@@ -828,13 +775,8 @@
       <w:r>
         <w:t xml:space="preserve">All </w:t>
       </w:r>
-      <w:proofErr w:type="spellStart"/>
-      <w:r>
-        <w:t>css</w:t>
-      </w:r>
-      <w:proofErr w:type="spellEnd"/>
-      <w:r>
-        <w:t xml:space="preserve"> files</w:t>
+      <w:r>
+        <w:t>css files</w:t>
       </w:r>
     </w:p>
     <w:p>
@@ -846,16 +788,10 @@
         </w:numPr>
       </w:pPr>
       <w:r>
-        <w:lastRenderedPageBreak/>
         <w:t xml:space="preserve">All </w:t>
       </w:r>
-      <w:proofErr w:type="spellStart"/>
-      <w:r>
-        <w:t>js</w:t>
-      </w:r>
-      <w:proofErr w:type="spellEnd"/>
-      <w:r>
-        <w:t xml:space="preserve"> files</w:t>
+      <w:r>
+        <w:t>js files</w:t>
       </w:r>
     </w:p>
     <w:p>
@@ -2307,6 +2243,7 @@
   <w:style w:type="character" w:default="1" w:styleId="DefaultParagraphFont">
     <w:name w:val="Default Paragraph Font"/>
     <w:uiPriority w:val="1"/>
+    <w:semiHidden/>
     <w:unhideWhenUsed/>
   </w:style>
   <w:style w:type="table" w:default="1" w:styleId="TableNormal">

</xml_diff>